<commit_message>
docs: cite the EMA modified release guideline after verifying its wording
EMA/CHMP/EWP/280/96 Rev1 (20 November 2014, effective 1 June 2015) section
6.8.2.2 allows the Cmax widening approach for Cmax,ss, Ctau,ss and partial AUC,
which is what the informational CVwR and implied limits in the variability
table already show. Added to the Methods page, the manual (Part VI and
Appendix D) and the handoff, which also records the section 6.1.1.2 wording on
the early and terminal split at half the dosing interval. D10 resolved.

Co-Authored-By: Claude Opus 5 <noreply@anthropic.com>
</commit_message>
<xml_diff>
--- a/NCA_Assistant_User_Manual_v1.6.docx
+++ b/NCA_Assistant_User_Manual_v1.6.docx
@@ -11347,6 +11347,14 @@
         <w:spacing w:after="120" w:line="276" w:lineRule="auto"/>
       </w:pPr>
       <w:r>
+        <w:t>The EMA allows the acceptance criteria for a partial AUC to be widened in the same way as for Cmax of a highly variable product (EMA/CHMP/EWP/280/96 Rev1, section 6.8.2.2). The app does not scale limits: for a replicate design it shows CVwR and the limits it would imply, and it applies the limits you enter. The same guideline recommends an early and a terminal partial AUC, split at a pre-specified cut-off such as half the dosing interval, when a single-dose study replaces a multiple-dose study.</w:t>
+      </w:r>
+    </w:p>
+    <w:p>
+      <w:pPr>
+        <w:spacing w:after="120" w:line="276" w:lineRule="auto"/>
+      </w:pPr>
+      <w:r>
         <w:t>Plan such a study with the CV of the partial AUC itself. For loxapine inhalation powder the within-subject CV was above 30% for AUC 0–10 min but below 30% for AUC 0–30 min, which is why the 30-minute window became the pivotal metric (Hopefl et al., 2025).</w:t>
       </w:r>
     </w:p>
@@ -13996,6 +14004,14 @@
       </w:r>
       <w:r>
         <w:t>. 2025;117:1185–1193.</w:t>
+      </w:r>
+    </w:p>
+    <w:p>
+      <w:pPr>
+        <w:spacing w:after="120" w:line="276" w:lineRule="auto"/>
+      </w:pPr>
+      <w:r>
+        <w:t>European Medicines Agency. Guideline on the pharmacokinetic and clinical evaluation of modified release dosage forms. EMA/CHMP/EWP/280/96 Rev1. Adopted 20 November 2014, effective 1 June 2015.</w:t>
       </w:r>
     </w:p>
     <w:sectPr>

</xml_diff>

<commit_message>
fix: report profiles that rest mainly on BLQ-derived values in bioequivalence
Review finding 1: with BLQ rule 1 an early window can be exactly zero, which
suppresses the metric, but with rule 6 the same sample becomes LLOQ/2 and the
metric keeps a verdict that one imputed value helped decide, with nothing in
the table saying so. run_nca() now carries the per-profile BLQ dependence with
its result, and the CI table reports "Mostly BLQ (Test/Reference)" beside the
zero and missing counts. Cmax in an interval inherits its interval's flag.

Review finding 2: the flag is no longer called .is_blq. It is BLQ_flag, a
documented column of the processed data, described in the data preview, the
Data Guide and the manual.

Also fixes the stale "v1.2" running header of the IQ/OQ/PQ protocol, which the
generator now keeps in step with the app version.

Co-Authored-By: Claude Opus 5 <noreply@anthropic.com>
</commit_message>
<xml_diff>
--- a/NCA_Assistant_User_Manual_v1.6.docx
+++ b/NCA_Assistant_User_Manual_v1.6.docx
@@ -1009,7 +1009,6 @@
         <w:alias w:val="Table of Contents"/>
         <w:id w:val="-1533791606"/>
       </w:sdtPr>
-      <w:sdtEndPr/>
       <w:sdtContent>
         <w:p>
           <w:pPr>
@@ -1027,7 +1026,7 @@
             </w:rPr>
           </w:pPr>
           <w:r>
-            <w:fldChar w:fldCharType="begin" w:dirty="true"/>
+            <w:fldChar w:fldCharType="begin"/>
           </w:r>
           <w:r>
             <w:instrText>TOC \h \o "1-3"</w:instrText>
@@ -9608,7 +9607,19 @@
         <w:spacing w:after="120" w:line="276" w:lineRule="auto"/>
       </w:pPr>
       <w:r>
-        <w:t>The rule matters most for partial AUCs. An early window often holds BLQ samples, which Rule 1 sets to 0 and Rule 6 to LLOQ/2, and a late window over a plateau near the LLOQ can rest mainly on values the rule produced. The app says so when more than half of the samples in a window come from the BLQ rule, or when fewer than three measurable concentrations are left in it.</w:t>
+        <w:t>In the processed data the app adds a BLQ_flag column marking every value the rule set. It appears in the data preview, and the partial AUC notes and the bioequivalence table use it to report how much of a result rests on such values. A column of that name in your file is replaced.</w:t>
+      </w:r>
+    </w:p>
+    <w:p>
+      <w:pPr>
+        <w:spacing w:after="120" w:line="276" w:lineRule="auto"/>
+      </w:pPr>
+      <w:r>
+        <w:t xml:space="preserve">The rule matters most for partial AUCs. An early window often holds BLQ samples, which Rule 1 sets to 0 and Rule 6 to LLOQ/2, and a late window over a plateau near the LLOQ can rest mainly on values the rule produced. The app says so when more than half of the </w:t>
+      </w:r>
+      <w:r>
+        <w:lastRenderedPageBreak/>
+        <w:t>samples in a window come from the BLQ rule, or when fewer than three measurable concentrations are left in it.</w:t>
       </w:r>
     </w:p>
     <w:p>
@@ -9630,7 +9641,6 @@
           <w:b/>
           <w:bCs/>
         </w:rPr>
-        <w:lastRenderedPageBreak/>
         <w:t>Wide format</w:t>
       </w:r>
       <w:r>
@@ -10599,10 +10609,11 @@
         <w:t xml:space="preserve">Questions: </w:t>
       </w:r>
       <w:r>
-        <w:rPr>
-          <w:b w:val="0"/>
-        </w:rPr>
-        <w:t>1) Work out AUC 0–1 h for subject 1 under Test by hand, from the first four samples (0, 12.3, 45.6 and 89.2 ng/mL), and compare it with the table. 2) Ratio and 90% CI for AUC 0–1 h? 3) What does the table show for AUC 4 h–t, and why? 4) Ratio for Cmax within 0–1 h?</w:t>
+        <w:t xml:space="preserve">1) Work out AUC 0–1 h for subject 1 under Test by hand, from the first four samples (0, 12.3, 45.6 and 89.2 ng/mL), and compare it with the table. 2) Ratio and 90% CI </w:t>
+      </w:r>
+      <w:r>
+        <w:lastRenderedPageBreak/>
+        <w:t>for AUC 0–1 h? 3) What does the table show for AUC 4 h–t, and why? 4) Ratio for Cmax within 0–1 h?</w:t>
       </w:r>
     </w:p>
     <w:p>
@@ -11340,6 +11351,14 @@
       <w:r>
         <w:lastRenderedPageBreak/>
         <w:t>up, so the app reports no estimate and no verdict for that metric and shows how many zero values each treatment had.</w:t>
+      </w:r>
+    </w:p>
+    <w:p>
+      <w:pPr>
+        <w:spacing w:after="120" w:line="276" w:lineRule="auto"/>
+      </w:pPr>
+      <w:r>
+        <w:t>For every metric the table also counts, per treatment, the profiles that had no value, the profiles with a value of zero, and the profiles resting mainly on concentrations set by the BLQ rule. The last count matters because such a profile can pull a ratio on the log scale without ever being zero: under Rule 1 an early window may be exactly zero and get no verdict, while under Rule 6 the same sample becomes LLOQ/2 and the metric keeps a verdict that one imputed value helped to decide.</w:t>
       </w:r>
     </w:p>
     <w:p>

</xml_diff>

<commit_message>
feat: dose-normalise partial AUCs and Cmax within an interval
Review finding 3: ticking "Calculate dose-normalized parameters" produced _DN
columns for Cmax and the whole-profile AUCs but silently skipped the intervals
the user defined. Interval AUC and Cmax are now normalised as well, with the
per-subject dose matched by subject; Tmax is not, being a time. The labels read
"Dose-Normalised Partial AUC 0-1" so no concentration unit is appended, and the
CDISC code is AUCINTD, taken from the pinned release.

Co-Authored-By: Claude Opus 5 <noreply@anthropic.com>
</commit_message>
<xml_diff>
--- a/NCA_Assistant_User_Manual_v1.6.docx
+++ b/NCA_Assistant_User_Manual_v1.6.docx
@@ -1026,7 +1026,7 @@
             </w:rPr>
           </w:pPr>
           <w:r>
-            <w:fldChar w:fldCharType="begin"/>
+            <w:fldChar w:fldCharType="begin" w:dirty="true"/>
           </w:r>
           <w:r>
             <w:instrText>TOC \h \o "1-3"</w:instrText>
@@ -10167,6 +10167,14 @@
       </w:pPr>
       <w:r>
         <w:t>Partial AUCs (optional): set how many intervals you need and enter the start and end of each, in the time unit of your data. Tick “End at the last measurable concentration (t)” for an interval that runs to the end of each profile, and “Also report Cmax and Tmax in this interval” when the protocol asks for the peak inside a window. The columns join the results table, the summary statistics and the downloads. An interval that reaches past the last measurable concentration of a profile stays empty for that profile, and a note names the profile and its last measurable time.</w:t>
+      </w:r>
+    </w:p>
+    <w:p>
+      <w:pPr>
+        <w:spacing w:after="120" w:line="276" w:lineRule="auto"/>
+      </w:pPr>
+      <w:r>
+        <w:t>With dose normalisation switched on, the partial AUCs and the Cmax within an interval are divided by the dose as well; the time of that maximum is not.</w:t>
       </w:r>
     </w:p>
     <w:p>

</xml_diff>